<commit_message>
Resolve duplicate articles in หมวด 17-36 and add anti-coup Article 1136
</commit_message>
<xml_diff>
--- a/สารบัญรัฐธรรมนูญ.docx
+++ b/สารบัญรัฐธรรมนูญ.docx
@@ -3040,7 +3040,7 @@
                 <w:szCs w:val="28"/>
                 <w:lang w:val="th-TH" w:bidi="th-TH" w:eastAsia="th-TH"/>
               </w:rPr>
-              <w:t>๑๑๕๘</w:t>
+              <w:t>๑๑๕๙</w:t>
             </w:r>
           </w:p>
         </w:tc>
@@ -3063,7 +3063,7 @@
           <w:bCs/>
           <w:lang w:val="th-TH" w:bidi="th-TH" w:eastAsia="th-TH"/>
         </w:rPr>
-        <w:t>รวมทั้งสิ้น ๓๘ หมวด  ๑๑๕๘ มาตรา</w:t>
+        <w:t>รวมทั้งสิ้น ๓๘ หมวด  ๑๑๕๙ มาตรา</w:t>
       </w:r>
     </w:p>
     <w:sectPr>

</xml_diff>